<commit_message>
Cập nhật file hướng dẫn
</commit_message>
<xml_diff>
--- a/HUONG_DAN_SshTunnelManager.docx
+++ b/HUONG_DAN_SshTunnelManager.docx
@@ -112,12 +112,6 @@
         <w:gridCol w:w="3560"/>
       </w:tblGrid>
       <w:tr>
-        <w:tblPrEx>
-          <w:tblCellMar>
-            <w:top w:w="0" w:type="dxa"/>
-            <w:bottom w:w="0" w:type="dxa"/>
-          </w:tblCellMar>
-        </w:tblPrEx>
         <w:tc>
           <w:tcPr>
             <w:tcW w:w="3000" w:type="dxa"/>
@@ -210,12 +204,6 @@
         </w:tc>
       </w:tr>
       <w:tr>
-        <w:tblPrEx>
-          <w:tblCellMar>
-            <w:top w:w="0" w:type="dxa"/>
-            <w:bottom w:w="0" w:type="dxa"/>
-          </w:tblCellMar>
-        </w:tblPrEx>
         <w:tc>
           <w:tcPr>
             <w:tcW w:w="3000" w:type="dxa"/>
@@ -299,12 +287,6 @@
         </w:tc>
       </w:tr>
       <w:tr>
-        <w:tblPrEx>
-          <w:tblCellMar>
-            <w:top w:w="0" w:type="dxa"/>
-            <w:bottom w:w="0" w:type="dxa"/>
-          </w:tblCellMar>
-        </w:tblPrEx>
         <w:tc>
           <w:tcPr>
             <w:tcW w:w="3000" w:type="dxa"/>
@@ -388,12 +370,6 @@
         </w:tc>
       </w:tr>
       <w:tr>
-        <w:tblPrEx>
-          <w:tblCellMar>
-            <w:top w:w="0" w:type="dxa"/>
-            <w:bottom w:w="0" w:type="dxa"/>
-          </w:tblCellMar>
-        </w:tblPrEx>
         <w:tc>
           <w:tcPr>
             <w:tcW w:w="3000" w:type="dxa"/>
@@ -477,12 +453,6 @@
         </w:tc>
       </w:tr>
       <w:tr>
-        <w:tblPrEx>
-          <w:tblCellMar>
-            <w:top w:w="0" w:type="dxa"/>
-            <w:bottom w:w="0" w:type="dxa"/>
-          </w:tblCellMar>
-        </w:tblPrEx>
         <w:tc>
           <w:tcPr>
             <w:tcW w:w="3000" w:type="dxa"/>
@@ -566,12 +536,6 @@
         </w:tc>
       </w:tr>
       <w:tr>
-        <w:tblPrEx>
-          <w:tblCellMar>
-            <w:top w:w="0" w:type="dxa"/>
-            <w:bottom w:w="0" w:type="dxa"/>
-          </w:tblCellMar>
-        </w:tblPrEx>
         <w:tc>
           <w:tcPr>
             <w:tcW w:w="3000" w:type="dxa"/>
@@ -655,12 +619,6 @@
         </w:tc>
       </w:tr>
       <w:tr>
-        <w:tblPrEx>
-          <w:tblCellMar>
-            <w:top w:w="0" w:type="dxa"/>
-            <w:bottom w:w="0" w:type="dxa"/>
-          </w:tblCellMar>
-        </w:tblPrEx>
         <w:tc>
           <w:tcPr>
             <w:tcW w:w="3000" w:type="dxa"/>
@@ -825,12 +783,6 @@
         <w:gridCol w:w="1627"/>
       </w:tblGrid>
       <w:tr>
-        <w:tblPrEx>
-          <w:tblCellMar>
-            <w:top w:w="0" w:type="dxa"/>
-            <w:bottom w:w="0" w:type="dxa"/>
-          </w:tblCellMar>
-        </w:tblPrEx>
         <w:tc>
           <w:tcPr>
             <w:tcW w:w="2800" w:type="dxa"/>
@@ -923,12 +875,6 @@
         </w:tc>
       </w:tr>
       <w:tr>
-        <w:tblPrEx>
-          <w:tblCellMar>
-            <w:top w:w="0" w:type="dxa"/>
-            <w:bottom w:w="0" w:type="dxa"/>
-          </w:tblCellMar>
-        </w:tblPrEx>
         <w:tc>
           <w:tcPr>
             <w:tcW w:w="2800" w:type="dxa"/>
@@ -1012,12 +958,6 @@
         </w:tc>
       </w:tr>
       <w:tr>
-        <w:tblPrEx>
-          <w:tblCellMar>
-            <w:top w:w="0" w:type="dxa"/>
-            <w:bottom w:w="0" w:type="dxa"/>
-          </w:tblCellMar>
-        </w:tblPrEx>
         <w:tc>
           <w:tcPr>
             <w:tcW w:w="2800" w:type="dxa"/>
@@ -1101,12 +1041,6 @@
         </w:tc>
       </w:tr>
       <w:tr>
-        <w:tblPrEx>
-          <w:tblCellMar>
-            <w:top w:w="0" w:type="dxa"/>
-            <w:bottom w:w="0" w:type="dxa"/>
-          </w:tblCellMar>
-        </w:tblPrEx>
         <w:tc>
           <w:tcPr>
             <w:tcW w:w="2800" w:type="dxa"/>
@@ -1576,12 +1510,6 @@
         <w:gridCol w:w="5560"/>
       </w:tblGrid>
       <w:tr>
-        <w:tblPrEx>
-          <w:tblCellMar>
-            <w:top w:w="0" w:type="dxa"/>
-            <w:bottom w:w="0" w:type="dxa"/>
-          </w:tblCellMar>
-        </w:tblPrEx>
         <w:tc>
           <w:tcPr>
             <w:tcW w:w="1000" w:type="dxa"/>
@@ -1674,12 +1602,6 @@
         </w:tc>
       </w:tr>
       <w:tr>
-        <w:tblPrEx>
-          <w:tblCellMar>
-            <w:top w:w="0" w:type="dxa"/>
-            <w:bottom w:w="0" w:type="dxa"/>
-          </w:tblCellMar>
-        </w:tblPrEx>
         <w:tc>
           <w:tcPr>
             <w:tcW w:w="1000" w:type="dxa"/>
@@ -1764,12 +1686,6 @@
         </w:tc>
       </w:tr>
       <w:tr>
-        <w:tblPrEx>
-          <w:tblCellMar>
-            <w:top w:w="0" w:type="dxa"/>
-            <w:bottom w:w="0" w:type="dxa"/>
-          </w:tblCellMar>
-        </w:tblPrEx>
         <w:tc>
           <w:tcPr>
             <w:tcW w:w="1000" w:type="dxa"/>
@@ -1989,12 +1905,6 @@
         <w:gridCol w:w="6360"/>
       </w:tblGrid>
       <w:tr>
-        <w:tblPrEx>
-          <w:tblCellMar>
-            <w:top w:w="0" w:type="dxa"/>
-            <w:bottom w:w="0" w:type="dxa"/>
-          </w:tblCellMar>
-        </w:tblPrEx>
         <w:tc>
           <w:tcPr>
             <w:tcW w:w="3000" w:type="dxa"/>
@@ -2057,12 +1967,6 @@
         </w:tc>
       </w:tr>
       <w:tr>
-        <w:tblPrEx>
-          <w:tblCellMar>
-            <w:top w:w="0" w:type="dxa"/>
-            <w:bottom w:w="0" w:type="dxa"/>
-          </w:tblCellMar>
-        </w:tblPrEx>
         <w:tc>
           <w:tcPr>
             <w:tcW w:w="3000" w:type="dxa"/>
@@ -2119,12 +2023,6 @@
         </w:tc>
       </w:tr>
       <w:tr>
-        <w:tblPrEx>
-          <w:tblCellMar>
-            <w:top w:w="0" w:type="dxa"/>
-            <w:bottom w:w="0" w:type="dxa"/>
-          </w:tblCellMar>
-        </w:tblPrEx>
         <w:tc>
           <w:tcPr>
             <w:tcW w:w="3000" w:type="dxa"/>
@@ -2576,12 +2474,6 @@
         <w:gridCol w:w="6360"/>
       </w:tblGrid>
       <w:tr>
-        <w:tblPrEx>
-          <w:tblCellMar>
-            <w:top w:w="0" w:type="dxa"/>
-            <w:bottom w:w="0" w:type="dxa"/>
-          </w:tblCellMar>
-        </w:tblPrEx>
         <w:tc>
           <w:tcPr>
             <w:tcW w:w="3000" w:type="dxa"/>
@@ -2644,12 +2536,6 @@
         </w:tc>
       </w:tr>
       <w:tr>
-        <w:tblPrEx>
-          <w:tblCellMar>
-            <w:top w:w="0" w:type="dxa"/>
-            <w:bottom w:w="0" w:type="dxa"/>
-          </w:tblCellMar>
-        </w:tblPrEx>
         <w:tc>
           <w:tcPr>
             <w:tcW w:w="3000" w:type="dxa"/>
@@ -2706,12 +2592,6 @@
         </w:tc>
       </w:tr>
       <w:tr>
-        <w:tblPrEx>
-          <w:tblCellMar>
-            <w:top w:w="0" w:type="dxa"/>
-            <w:bottom w:w="0" w:type="dxa"/>
-          </w:tblCellMar>
-        </w:tblPrEx>
         <w:tc>
           <w:tcPr>
             <w:tcW w:w="3000" w:type="dxa"/>
@@ -2768,12 +2648,6 @@
         </w:tc>
       </w:tr>
       <w:tr>
-        <w:tblPrEx>
-          <w:tblCellMar>
-            <w:top w:w="0" w:type="dxa"/>
-            <w:bottom w:w="0" w:type="dxa"/>
-          </w:tblCellMar>
-        </w:tblPrEx>
         <w:tc>
           <w:tcPr>
             <w:tcW w:w="3000" w:type="dxa"/>
@@ -2830,12 +2704,6 @@
         </w:tc>
       </w:tr>
       <w:tr>
-        <w:tblPrEx>
-          <w:tblCellMar>
-            <w:top w:w="0" w:type="dxa"/>
-            <w:bottom w:w="0" w:type="dxa"/>
-          </w:tblCellMar>
-        </w:tblPrEx>
         <w:tc>
           <w:tcPr>
             <w:tcW w:w="3000" w:type="dxa"/>
@@ -2892,12 +2760,6 @@
         </w:tc>
       </w:tr>
       <w:tr>
-        <w:tblPrEx>
-          <w:tblCellMar>
-            <w:top w:w="0" w:type="dxa"/>
-            <w:bottom w:w="0" w:type="dxa"/>
-          </w:tblCellMar>
-        </w:tblPrEx>
         <w:tc>
           <w:tcPr>
             <w:tcW w:w="3000" w:type="dxa"/>
@@ -3293,12 +3155,6 @@
         <w:gridCol w:w="3600"/>
       </w:tblGrid>
       <w:tr>
-        <w:tblPrEx>
-          <w:tblCellMar>
-            <w:top w:w="0" w:type="dxa"/>
-            <w:bottom w:w="0" w:type="dxa"/>
-          </w:tblCellMar>
-        </w:tblPrEx>
         <w:tc>
           <w:tcPr>
             <w:tcW w:w="3200" w:type="dxa"/>
@@ -3391,12 +3247,6 @@
         </w:tc>
       </w:tr>
       <w:tr>
-        <w:tblPrEx>
-          <w:tblCellMar>
-            <w:top w:w="0" w:type="dxa"/>
-            <w:bottom w:w="0" w:type="dxa"/>
-          </w:tblCellMar>
-        </w:tblPrEx>
         <w:tc>
           <w:tcPr>
             <w:tcW w:w="3200" w:type="dxa"/>
@@ -3480,12 +3330,6 @@
         </w:tc>
       </w:tr>
       <w:tr>
-        <w:tblPrEx>
-          <w:tblCellMar>
-            <w:top w:w="0" w:type="dxa"/>
-            <w:bottom w:w="0" w:type="dxa"/>
-          </w:tblCellMar>
-        </w:tblPrEx>
         <w:tc>
           <w:tcPr>
             <w:tcW w:w="3200" w:type="dxa"/>
@@ -3569,12 +3413,6 @@
         </w:tc>
       </w:tr>
       <w:tr>
-        <w:tblPrEx>
-          <w:tblCellMar>
-            <w:top w:w="0" w:type="dxa"/>
-            <w:bottom w:w="0" w:type="dxa"/>
-          </w:tblCellMar>
-        </w:tblPrEx>
         <w:tc>
           <w:tcPr>
             <w:tcW w:w="3200" w:type="dxa"/>
@@ -3748,12 +3586,6 @@
         <w:gridCol w:w="4591"/>
       </w:tblGrid>
       <w:tr>
-        <w:tblPrEx>
-          <w:tblCellMar>
-            <w:top w:w="0" w:type="dxa"/>
-            <w:bottom w:w="0" w:type="dxa"/>
-          </w:tblCellMar>
-        </w:tblPrEx>
         <w:tc>
           <w:tcPr>
             <w:tcW w:w="2600" w:type="dxa"/>
@@ -3867,12 +3699,6 @@
         </w:tc>
       </w:tr>
       <w:tr>
-        <w:tblPrEx>
-          <w:tblCellMar>
-            <w:top w:w="0" w:type="dxa"/>
-            <w:bottom w:w="0" w:type="dxa"/>
-          </w:tblCellMar>
-        </w:tblPrEx>
         <w:tc>
           <w:tcPr>
             <w:tcW w:w="2600" w:type="dxa"/>
@@ -3956,12 +3782,6 @@
         </w:tc>
       </w:tr>
       <w:tr>
-        <w:tblPrEx>
-          <w:tblCellMar>
-            <w:top w:w="0" w:type="dxa"/>
-            <w:bottom w:w="0" w:type="dxa"/>
-          </w:tblCellMar>
-        </w:tblPrEx>
         <w:tc>
           <w:tcPr>
             <w:tcW w:w="2600" w:type="dxa"/>
@@ -4045,12 +3865,6 @@
         </w:tc>
       </w:tr>
       <w:tr>
-        <w:tblPrEx>
-          <w:tblCellMar>
-            <w:top w:w="0" w:type="dxa"/>
-            <w:bottom w:w="0" w:type="dxa"/>
-          </w:tblCellMar>
-        </w:tblPrEx>
         <w:tc>
           <w:tcPr>
             <w:tcW w:w="2600" w:type="dxa"/>
@@ -4134,12 +3948,6 @@
         </w:tc>
       </w:tr>
       <w:tr>
-        <w:tblPrEx>
-          <w:tblCellMar>
-            <w:top w:w="0" w:type="dxa"/>
-            <w:bottom w:w="0" w:type="dxa"/>
-          </w:tblCellMar>
-        </w:tblPrEx>
         <w:tc>
           <w:tcPr>
             <w:tcW w:w="2600" w:type="dxa"/>
@@ -4251,12 +4059,6 @@
         <w:gridCol w:w="4591"/>
       </w:tblGrid>
       <w:tr>
-        <w:tblPrEx>
-          <w:tblCellMar>
-            <w:top w:w="0" w:type="dxa"/>
-            <w:bottom w:w="0" w:type="dxa"/>
-          </w:tblCellMar>
-        </w:tblPrEx>
         <w:tc>
           <w:tcPr>
             <w:tcW w:w="2600" w:type="dxa"/>
@@ -4313,8 +4115,28 @@
                 <w:sz w:val="20"/>
                 <w:szCs w:val="20"/>
               </w:rPr>
-              <w:t>Ví dụ (VNC</w:t>
-            </w:r>
+              <w:t>Ví dụ (VNC – Máy B)</w:t>
+            </w:r>
+          </w:p>
+        </w:tc>
+        <w:tc>
+          <w:tcPr>
+            <w:tcW w:w="4591" w:type="dxa"/>
+            <w:tcBorders>
+              <w:top w:val="single" w:sz="1" w:space="0" w:color="CCCCCC"/>
+              <w:left w:val="single" w:sz="1" w:space="0" w:color="CCCCCC"/>
+              <w:bottom w:val="single" w:sz="1" w:space="0" w:color="CCCCCC"/>
+              <w:right w:val="single" w:sz="1" w:space="0" w:color="CCCCCC"/>
+            </w:tcBorders>
+            <w:shd w:val="clear" w:color="auto" w:fill="1F3864"/>
+            <w:tcMar>
+              <w:top w:w="80" w:type="dxa"/>
+              <w:left w:w="120" w:type="dxa"/>
+              <w:bottom w:w="80" w:type="dxa"/>
+              <w:right w:w="120" w:type="dxa"/>
+            </w:tcMar>
+          </w:tcPr>
+          <w:p>
             <w:r>
               <w:rPr>
                 <w:b/>
@@ -4323,58 +4145,12 @@
                 <w:sz w:val="20"/>
                 <w:szCs w:val="20"/>
               </w:rPr>
-              <w:t xml:space="preserve"> – Máy B</w:t>
-            </w:r>
-            <w:r>
-              <w:rPr>
-                <w:b/>
-                <w:bCs/>
-                <w:color w:val="FFFFFF"/>
-                <w:sz w:val="20"/>
-                <w:szCs w:val="20"/>
-              </w:rPr>
-              <w:t>)</w:t>
-            </w:r>
-          </w:p>
-        </w:tc>
-        <w:tc>
-          <w:tcPr>
-            <w:tcW w:w="4591" w:type="dxa"/>
-            <w:tcBorders>
-              <w:top w:val="single" w:sz="1" w:space="0" w:color="CCCCCC"/>
-              <w:left w:val="single" w:sz="1" w:space="0" w:color="CCCCCC"/>
-              <w:bottom w:val="single" w:sz="1" w:space="0" w:color="CCCCCC"/>
-              <w:right w:val="single" w:sz="1" w:space="0" w:color="CCCCCC"/>
-            </w:tcBorders>
-            <w:shd w:val="clear" w:color="auto" w:fill="1F3864"/>
-            <w:tcMar>
-              <w:top w:w="80" w:type="dxa"/>
-              <w:left w:w="120" w:type="dxa"/>
-              <w:bottom w:w="80" w:type="dxa"/>
-              <w:right w:w="120" w:type="dxa"/>
-            </w:tcMar>
-          </w:tcPr>
-          <w:p>
-            <w:r>
-              <w:rPr>
-                <w:b/>
-                <w:bCs/>
-                <w:color w:val="FFFFFF"/>
-                <w:sz w:val="20"/>
-                <w:szCs w:val="20"/>
-              </w:rPr>
               <w:t>Giải thích</w:t>
             </w:r>
           </w:p>
         </w:tc>
       </w:tr>
       <w:tr>
-        <w:tblPrEx>
-          <w:tblCellMar>
-            <w:top w:w="0" w:type="dxa"/>
-            <w:bottom w:w="0" w:type="dxa"/>
-          </w:tblCellMar>
-        </w:tblPrEx>
         <w:tc>
           <w:tcPr>
             <w:tcW w:w="2600" w:type="dxa"/>
@@ -4458,12 +4234,6 @@
         </w:tc>
       </w:tr>
       <w:tr>
-        <w:tblPrEx>
-          <w:tblCellMar>
-            <w:top w:w="0" w:type="dxa"/>
-            <w:bottom w:w="0" w:type="dxa"/>
-          </w:tblCellMar>
-        </w:tblPrEx>
         <w:tc>
           <w:tcPr>
             <w:tcW w:w="2600" w:type="dxa"/>
@@ -4514,14 +4284,7 @@
                 <w:sz w:val="20"/>
                 <w:szCs w:val="20"/>
               </w:rPr>
-              <w:t>590</w:t>
-            </w:r>
-            <w:r>
-              <w:rPr>
-                <w:sz w:val="20"/>
-                <w:szCs w:val="20"/>
-              </w:rPr>
-              <w:t>0</w:t>
+              <w:t>5900</w:t>
             </w:r>
           </w:p>
         </w:tc>
@@ -4548,32 +4311,12 @@
                 <w:sz w:val="20"/>
                 <w:szCs w:val="20"/>
               </w:rPr>
-              <w:t xml:space="preserve">Port mở trên Máy </w:t>
-            </w:r>
-            <w:r>
-              <w:rPr>
-                <w:sz w:val="20"/>
-                <w:szCs w:val="20"/>
-              </w:rPr>
-              <w:t>B</w:t>
-            </w:r>
-            <w:r>
-              <w:rPr>
-                <w:sz w:val="20"/>
-                <w:szCs w:val="20"/>
-              </w:rPr>
-              <w:t xml:space="preserve"> để kết nối vào</w:t>
+              <w:t>Port mở trên Máy B để kết nối vào</w:t>
             </w:r>
           </w:p>
         </w:tc>
       </w:tr>
       <w:tr>
-        <w:tblPrEx>
-          <w:tblCellMar>
-            <w:top w:w="0" w:type="dxa"/>
-            <w:bottom w:w="0" w:type="dxa"/>
-          </w:tblCellMar>
-        </w:tblPrEx>
         <w:tc>
           <w:tcPr>
             <w:tcW w:w="2600" w:type="dxa"/>
@@ -4657,12 +4400,6 @@
         </w:tc>
       </w:tr>
       <w:tr>
-        <w:tblPrEx>
-          <w:tblCellMar>
-            <w:top w:w="0" w:type="dxa"/>
-            <w:bottom w:w="0" w:type="dxa"/>
-          </w:tblCellMar>
-        </w:tblPrEx>
         <w:tc>
           <w:tcPr>
             <w:tcW w:w="2600" w:type="dxa"/>
@@ -4811,12 +4548,6 @@
         <w:gridCol w:w="3960"/>
       </w:tblGrid>
       <w:tr>
-        <w:tblPrEx>
-          <w:tblCellMar>
-            <w:top w:w="0" w:type="dxa"/>
-            <w:bottom w:w="0" w:type="dxa"/>
-          </w:tblCellMar>
-        </w:tblPrEx>
         <w:tc>
           <w:tcPr>
             <w:tcW w:w="2600" w:type="dxa"/>
@@ -4909,12 +4640,6 @@
         </w:tc>
       </w:tr>
       <w:tr>
-        <w:tblPrEx>
-          <w:tblCellMar>
-            <w:top w:w="0" w:type="dxa"/>
-            <w:bottom w:w="0" w:type="dxa"/>
-          </w:tblCellMar>
-        </w:tblPrEx>
         <w:tc>
           <w:tcPr>
             <w:tcW w:w="2600" w:type="dxa"/>
@@ -4998,12 +4723,6 @@
         </w:tc>
       </w:tr>
       <w:tr>
-        <w:tblPrEx>
-          <w:tblCellMar>
-            <w:top w:w="0" w:type="dxa"/>
-            <w:bottom w:w="0" w:type="dxa"/>
-          </w:tblCellMar>
-        </w:tblPrEx>
         <w:tc>
           <w:tcPr>
             <w:tcW w:w="2600" w:type="dxa"/>
@@ -5087,12 +4806,6 @@
         </w:tc>
       </w:tr>
       <w:tr>
-        <w:tblPrEx>
-          <w:tblCellMar>
-            <w:top w:w="0" w:type="dxa"/>
-            <w:bottom w:w="0" w:type="dxa"/>
-          </w:tblCellMar>
-        </w:tblPrEx>
         <w:tc>
           <w:tcPr>
             <w:tcW w:w="2600" w:type="dxa"/>
@@ -5176,12 +4889,6 @@
         </w:tc>
       </w:tr>
       <w:tr>
-        <w:tblPrEx>
-          <w:tblCellMar>
-            <w:top w:w="0" w:type="dxa"/>
-            <w:bottom w:w="0" w:type="dxa"/>
-          </w:tblCellMar>
-        </w:tblPrEx>
         <w:tc>
           <w:tcPr>
             <w:tcW w:w="2600" w:type="dxa"/>
@@ -5265,12 +4972,6 @@
         </w:tc>
       </w:tr>
       <w:tr>
-        <w:tblPrEx>
-          <w:tblCellMar>
-            <w:top w:w="0" w:type="dxa"/>
-            <w:bottom w:w="0" w:type="dxa"/>
-          </w:tblCellMar>
-        </w:tblPrEx>
         <w:tc>
           <w:tcPr>
             <w:tcW w:w="2600" w:type="dxa"/>
@@ -5354,12 +5055,6 @@
         </w:tc>
       </w:tr>
       <w:tr>
-        <w:tblPrEx>
-          <w:tblCellMar>
-            <w:top w:w="0" w:type="dxa"/>
-            <w:bottom w:w="0" w:type="dxa"/>
-          </w:tblCellMar>
-        </w:tblPrEx>
         <w:tc>
           <w:tcPr>
             <w:tcW w:w="2600" w:type="dxa"/>
@@ -5443,12 +5138,6 @@
         </w:tc>
       </w:tr>
       <w:tr>
-        <w:tblPrEx>
-          <w:tblCellMar>
-            <w:top w:w="0" w:type="dxa"/>
-            <w:bottom w:w="0" w:type="dxa"/>
-          </w:tblCellMar>
-        </w:tblPrEx>
         <w:tc>
           <w:tcPr>
             <w:tcW w:w="2600" w:type="dxa"/>
@@ -5532,12 +5221,6 @@
         </w:tc>
       </w:tr>
       <w:tr>
-        <w:tblPrEx>
-          <w:tblCellMar>
-            <w:top w:w="0" w:type="dxa"/>
-            <w:bottom w:w="0" w:type="dxa"/>
-          </w:tblCellMar>
-        </w:tblPrEx>
         <w:tc>
           <w:tcPr>
             <w:tcW w:w="2600" w:type="dxa"/>
@@ -5621,12 +5304,6 @@
         </w:tc>
       </w:tr>
       <w:tr>
-        <w:tblPrEx>
-          <w:tblCellMar>
-            <w:top w:w="0" w:type="dxa"/>
-            <w:bottom w:w="0" w:type="dxa"/>
-          </w:tblCellMar>
-        </w:tblPrEx>
         <w:tc>
           <w:tcPr>
             <w:tcW w:w="2600" w:type="dxa"/>
@@ -5710,6 +5387,687 @@
         </w:tc>
       </w:tr>
     </w:tbl>
+    <w:p>
+      <w:pPr>
+        <w:spacing w:before="60" w:after="60"/>
+        <w:rPr>
+          <w:b/>
+          <w:bCs/>
+        </w:rPr>
+      </w:pPr>
+    </w:p>
+    <w:p>
+      <w:pPr>
+        <w:spacing w:before="60" w:after="60"/>
+        <w:rPr>
+          <w:b/>
+          <w:bCs/>
+        </w:rPr>
+      </w:pPr>
+      <w:r>
+        <w:rPr>
+          <w:b/>
+          <w:bCs/>
+        </w:rPr>
+        <w:t>Hướng dẫn xử lý lỗi SSH và cấu hình kết nối Tunnel</w:t>
+      </w:r>
+    </w:p>
+    <w:p>
+      <w:pPr>
+        <w:spacing w:before="60" w:after="60"/>
+        <w:rPr>
+          <w:b/>
+          <w:bCs/>
+        </w:rPr>
+      </w:pPr>
+      <w:r>
+        <w:rPr>
+          <w:b/>
+          <w:bCs/>
+        </w:rPr>
+        <w:t>1. Lỗi “UNPROTECTED PRIVATE KEY FILE”</w:t>
+      </w:r>
+    </w:p>
+    <w:p>
+      <w:pPr>
+        <w:spacing w:before="60" w:after="60"/>
+      </w:pPr>
+      <w:r>
+        <w:t>Trong quá trình kết nối VPS bằng SSH với file .pem, đôi khi hệ thống sẽ hiển thị lỗi:</w:t>
+      </w:r>
+    </w:p>
+    <w:p>
+      <w:pPr>
+        <w:spacing w:before="60" w:after="60"/>
+      </w:pPr>
+      <w:r>
+        <w:t>UNPROTECTED PRIVATE KEY FILE</w:t>
+      </w:r>
+    </w:p>
+    <w:p>
+      <w:pPr>
+        <w:spacing w:before="60" w:after="60"/>
+      </w:pPr>
+      <w:r>
+        <w:lastRenderedPageBreak/>
+        <w:t>Nguyên nhân là do file private key (.pem) đang có quyền truy cập quá rộng, khiến OpenSSH từ chối sử dụng vì lý do bảo mật.</w:t>
+      </w:r>
+    </w:p>
+    <w:p>
+      <w:pPr>
+        <w:spacing w:before="60" w:after="60"/>
+        <w:rPr>
+          <w:b/>
+          <w:bCs/>
+        </w:rPr>
+      </w:pPr>
+      <w:r>
+        <w:rPr>
+          <w:b/>
+          <w:bCs/>
+        </w:rPr>
+        <w:t>Cách khắc phục</w:t>
+      </w:r>
+    </w:p>
+    <w:p>
+      <w:pPr>
+        <w:spacing w:before="60" w:after="60"/>
+        <w:rPr>
+          <w:b/>
+          <w:bCs/>
+        </w:rPr>
+      </w:pPr>
+      <w:r>
+        <w:rPr>
+          <w:b/>
+          <w:bCs/>
+        </w:rPr>
+        <w:t>Bước 1: Mở thuộc tính file .pem</w:t>
+      </w:r>
+    </w:p>
+    <w:p>
+      <w:pPr>
+        <w:spacing w:before="60" w:after="60"/>
+      </w:pPr>
+      <w:r>
+        <w:t xml:space="preserve">Chuột phải vào file default_vps.pem → chọn </w:t>
+      </w:r>
+      <w:r>
+        <w:rPr>
+          <w:b/>
+          <w:bCs/>
+        </w:rPr>
+        <w:t>Properties</w:t>
+      </w:r>
+      <w:r>
+        <w:t>.</w:t>
+      </w:r>
+    </w:p>
+    <w:p>
+      <w:pPr>
+        <w:spacing w:before="60" w:after="60"/>
+        <w:rPr>
+          <w:b/>
+          <w:bCs/>
+        </w:rPr>
+      </w:pPr>
+      <w:r>
+        <w:rPr>
+          <w:b/>
+          <w:bCs/>
+        </w:rPr>
+        <w:t>Bước 2: Mở phần Security</w:t>
+      </w:r>
+    </w:p>
+    <w:p>
+      <w:pPr>
+        <w:spacing w:before="60" w:after="60"/>
+      </w:pPr>
+      <w:r>
+        <w:t xml:space="preserve">Chọn tab </w:t>
+      </w:r>
+      <w:r>
+        <w:rPr>
+          <w:b/>
+          <w:bCs/>
+        </w:rPr>
+        <w:t>Security</w:t>
+      </w:r>
+      <w:r>
+        <w:t xml:space="preserve"> → nhấn </w:t>
+      </w:r>
+      <w:r>
+        <w:rPr>
+          <w:b/>
+          <w:bCs/>
+        </w:rPr>
+        <w:t>Advanced</w:t>
+      </w:r>
+      <w:r>
+        <w:t>.</w:t>
+      </w:r>
+    </w:p>
+    <w:p>
+      <w:pPr>
+        <w:spacing w:before="60" w:after="60"/>
+        <w:rPr>
+          <w:b/>
+          <w:bCs/>
+        </w:rPr>
+      </w:pPr>
+      <w:r>
+        <w:rPr>
+          <w:b/>
+          <w:bCs/>
+        </w:rPr>
+        <w:t>Bước 3: Tắt quyền kế thừa</w:t>
+      </w:r>
+    </w:p>
+    <w:p>
+      <w:pPr>
+        <w:spacing w:before="60" w:after="60"/>
+      </w:pPr>
+      <w:r>
+        <w:t>Nhấn:</w:t>
+      </w:r>
+    </w:p>
+    <w:p>
+      <w:pPr>
+        <w:spacing w:before="60" w:after="60"/>
+      </w:pPr>
+      <w:r>
+        <w:t>Disable inheritance</w:t>
+      </w:r>
+    </w:p>
+    <w:p>
+      <w:pPr>
+        <w:spacing w:before="60" w:after="60"/>
+      </w:pPr>
+      <w:r>
+        <w:t>Sau đó chọn:</w:t>
+      </w:r>
+    </w:p>
+    <w:p>
+      <w:pPr>
+        <w:spacing w:before="60" w:after="60"/>
+      </w:pPr>
+      <w:r>
+        <w:t>Remove all inherited permissions from this object</w:t>
+      </w:r>
+    </w:p>
+    <w:p>
+      <w:pPr>
+        <w:spacing w:before="60" w:after="60"/>
+        <w:rPr>
+          <w:b/>
+          <w:bCs/>
+        </w:rPr>
+      </w:pPr>
+      <w:r>
+        <w:rPr>
+          <w:b/>
+          <w:bCs/>
+        </w:rPr>
+        <w:t>Bước 4: Thêm quyền cho tài khoản hiện tại</w:t>
+      </w:r>
+    </w:p>
+    <w:p>
+      <w:pPr>
+        <w:spacing w:before="60" w:after="60"/>
+      </w:pPr>
+      <w:r>
+        <w:t>Nhấn:</w:t>
+      </w:r>
+    </w:p>
+    <w:p>
+      <w:pPr>
+        <w:spacing w:before="60" w:after="60"/>
+      </w:pPr>
+      <w:r>
+        <w:t>Add → Select a principal</w:t>
+      </w:r>
+    </w:p>
+    <w:p>
+      <w:pPr>
+        <w:spacing w:before="60" w:after="60"/>
+      </w:pPr>
+      <w:r>
+        <w:t>Sau đó nhập tên tài khoản Windows hiện tại → nhấn:</w:t>
+      </w:r>
+    </w:p>
+    <w:p>
+      <w:pPr>
+        <w:spacing w:before="60" w:after="60"/>
+      </w:pPr>
+      <w:r>
+        <w:t>Check Names → OK</w:t>
+      </w:r>
+    </w:p>
+    <w:p>
+      <w:pPr>
+        <w:spacing w:before="60" w:after="60"/>
+        <w:rPr>
+          <w:b/>
+          <w:bCs/>
+        </w:rPr>
+      </w:pPr>
+      <w:r>
+        <w:rPr>
+          <w:b/>
+          <w:bCs/>
+        </w:rPr>
+        <w:t>Bước 5: Cấp toàn quyền</w:t>
+      </w:r>
+    </w:p>
+    <w:p>
+      <w:pPr>
+        <w:spacing w:before="60" w:after="60"/>
+      </w:pPr>
+      <w:r>
+        <w:t>Tick chọn:</w:t>
+      </w:r>
+    </w:p>
+    <w:p>
+      <w:pPr>
+        <w:spacing w:before="60" w:after="60"/>
+      </w:pPr>
+      <w:r>
+        <w:t>Full control</w:t>
+      </w:r>
+    </w:p>
+    <w:p>
+      <w:pPr>
+        <w:spacing w:before="60" w:after="60"/>
+      </w:pPr>
+      <w:r>
+        <w:t>Sau đó nhấn:</w:t>
+      </w:r>
+    </w:p>
+    <w:p>
+      <w:pPr>
+        <w:spacing w:before="60" w:after="60"/>
+      </w:pPr>
+      <w:r>
+        <w:t>OK → Apply</w:t>
+      </w:r>
+    </w:p>
+    <w:p>
+      <w:pPr>
+        <w:spacing w:before="60" w:after="60"/>
+        <w:rPr>
+          <w:b/>
+          <w:bCs/>
+        </w:rPr>
+      </w:pPr>
+      <w:r>
+        <w:rPr>
+          <w:b/>
+          <w:bCs/>
+        </w:rPr>
+        <w:t>Bước 6: Xóa các quyền không cần thiết</w:t>
+      </w:r>
+    </w:p>
+    <w:p>
+      <w:pPr>
+        <w:spacing w:before="60" w:after="60"/>
+      </w:pPr>
+      <w:r>
+        <w:t>Xóa các user/group như:</w:t>
+      </w:r>
+    </w:p>
+    <w:p>
+      <w:pPr>
+        <w:numPr>
+          <w:ilvl w:val="0"/>
+          <w:numId w:val="3"/>
+        </w:numPr>
+        <w:spacing w:before="60" w:after="60"/>
+      </w:pPr>
+      <w:r>
+        <w:t xml:space="preserve">Authenticated Users </w:t>
+      </w:r>
+    </w:p>
+    <w:p>
+      <w:pPr>
+        <w:numPr>
+          <w:ilvl w:val="0"/>
+          <w:numId w:val="3"/>
+        </w:numPr>
+        <w:spacing w:before="60" w:after="60"/>
+      </w:pPr>
+      <w:r>
+        <w:t xml:space="preserve">Users </w:t>
+      </w:r>
+    </w:p>
+    <w:p>
+      <w:pPr>
+        <w:numPr>
+          <w:ilvl w:val="0"/>
+          <w:numId w:val="3"/>
+        </w:numPr>
+        <w:spacing w:before="60" w:after="60"/>
+      </w:pPr>
+      <w:r>
+        <w:t xml:space="preserve">Everyone </w:t>
+      </w:r>
+    </w:p>
+    <w:p>
+      <w:pPr>
+        <w:spacing w:before="60" w:after="60"/>
+      </w:pPr>
+      <w:r>
+        <w:t>Chỉ nên giữ lại:</w:t>
+      </w:r>
+    </w:p>
+    <w:p>
+      <w:pPr>
+        <w:numPr>
+          <w:ilvl w:val="0"/>
+          <w:numId w:val="4"/>
+        </w:numPr>
+        <w:spacing w:before="60" w:after="60"/>
+      </w:pPr>
+      <w:r>
+        <w:t xml:space="preserve">Tài khoản Windows hiện tại </w:t>
+      </w:r>
+    </w:p>
+    <w:p>
+      <w:pPr>
+        <w:numPr>
+          <w:ilvl w:val="0"/>
+          <w:numId w:val="4"/>
+        </w:numPr>
+        <w:spacing w:before="60" w:after="60"/>
+      </w:pPr>
+      <w:r>
+        <w:t xml:space="preserve">SYSTEM (nếu có) </w:t>
+      </w:r>
+    </w:p>
+    <w:p>
+      <w:pPr>
+        <w:spacing w:before="60" w:after="60"/>
+        <w:rPr>
+          <w:b/>
+          <w:bCs/>
+        </w:rPr>
+      </w:pPr>
+      <w:r>
+        <w:rPr>
+          <w:b/>
+          <w:bCs/>
+        </w:rPr>
+        <w:t>Kiểm tra lại kết nối SSH</w:t>
+      </w:r>
+    </w:p>
+    <w:p>
+      <w:pPr>
+        <w:spacing w:before="60" w:after="60"/>
+      </w:pPr>
+      <w:r>
+        <w:t>Sau khi hoàn tất, thử kết nối lại VPS:</w:t>
+      </w:r>
+    </w:p>
+    <w:p>
+      <w:pPr>
+        <w:spacing w:before="60" w:after="60"/>
+      </w:pPr>
+      <w:r>
+        <w:t>ssh -i "D:\puTTY_Tunnel\publish\default_vps.pem" ubuntu@13.229.239.111</w:t>
+      </w:r>
+    </w:p>
+    <w:p>
+      <w:pPr>
+        <w:spacing w:before="60" w:after="60"/>
+      </w:pPr>
+      <w:r>
+        <w:t>Nếu không còn báo lỗi thì quá trình sửa quyền file đã thành công.</w:t>
+      </w:r>
+    </w:p>
+    <w:p>
+      <w:pPr>
+        <w:spacing w:before="60" w:after="60"/>
+      </w:pPr>
+      <w:r>
+        <w:pict w14:anchorId="1715108D">
+          <v:rect id="_x0000_i1049" style="width:0;height:1.5pt" o:hralign="center" o:hrstd="t" o:hr="t" fillcolor="#a0a0a0" stroked="f"/>
+        </w:pict>
+      </w:r>
+    </w:p>
+    <w:p>
+      <w:pPr>
+        <w:spacing w:before="60" w:after="60"/>
+        <w:rPr>
+          <w:b/>
+          <w:bCs/>
+        </w:rPr>
+      </w:pPr>
+      <w:r>
+        <w:rPr>
+          <w:b/>
+          <w:bCs/>
+        </w:rPr>
+        <w:t>2. Cách xử lý lỗi Plink không kết nối được VPS</w:t>
+      </w:r>
+    </w:p>
+    <w:p>
+      <w:pPr>
+        <w:spacing w:before="60" w:after="60"/>
+      </w:pPr>
+      <w:r>
+        <w:t>Trong lần kết nối đầu tiên, plink.exe có thể không hoạt động do host key của VPS chưa được lưu vào PuTTY Registry.</w:t>
+      </w:r>
+    </w:p>
+    <w:p>
+      <w:pPr>
+        <w:spacing w:before="60" w:after="60"/>
+        <w:rPr>
+          <w:b/>
+          <w:bCs/>
+        </w:rPr>
+      </w:pPr>
+      <w:r>
+        <w:rPr>
+          <w:b/>
+          <w:bCs/>
+        </w:rPr>
+        <w:t>Bước 1: Mở CMD hoặc PowerShell</w:t>
+      </w:r>
+    </w:p>
+    <w:p>
+      <w:pPr>
+        <w:spacing w:before="60" w:after="60"/>
+      </w:pPr>
+      <w:r>
+        <w:t>Chạy lệnh thủ công:</w:t>
+      </w:r>
+    </w:p>
+    <w:p>
+      <w:pPr>
+        <w:spacing w:before="60" w:after="60"/>
+      </w:pPr>
+      <w:r>
+        <w:t>plink.exe -ssh ubuntu@13.229.239.111 -P 22 -i "D:\puTTY_Tunnel\publish\default_vps.ppk"</w:t>
+      </w:r>
+    </w:p>
+    <w:p>
+      <w:pPr>
+        <w:spacing w:before="60" w:after="60"/>
+      </w:pPr>
+      <w:r>
+        <w:t>Nếu plink.exe không nằm trong PATH thì sử dụng đầy đủ đường dẫn:</w:t>
+      </w:r>
+    </w:p>
+    <w:p>
+      <w:pPr>
+        <w:spacing w:before="60" w:after="60"/>
+      </w:pPr>
+      <w:r>
+        <w:t>"D:\puTTY_Tunnel\plink.exe" -ssh ubuntu@13.229.239.111 -P 22 -i "D:\puTTY_Tunnel\publish\default_vps.ppk"</w:t>
+      </w:r>
+    </w:p>
+    <w:p>
+      <w:pPr>
+        <w:spacing w:before="60" w:after="60"/>
+      </w:pPr>
+      <w:r>
+        <w:lastRenderedPageBreak/>
+        <w:pict w14:anchorId="1E289F4E">
+          <v:rect id="_x0000_i1050" style="width:0;height:1.5pt" o:hralign="center" o:hrstd="t" o:hr="t" fillcolor="#a0a0a0" stroked="f"/>
+        </w:pict>
+      </w:r>
+    </w:p>
+    <w:p>
+      <w:pPr>
+        <w:spacing w:before="60" w:after="60"/>
+        <w:rPr>
+          <w:b/>
+          <w:bCs/>
+        </w:rPr>
+      </w:pPr>
+      <w:r>
+        <w:rPr>
+          <w:b/>
+          <w:bCs/>
+        </w:rPr>
+        <w:t>Bước 2: Xác nhận host key</w:t>
+      </w:r>
+    </w:p>
+    <w:p>
+      <w:pPr>
+        <w:spacing w:before="60" w:after="60"/>
+      </w:pPr>
+      <w:r>
+        <w:t>Lần đầu kết nối, PuTTY sẽ hiển thị thông báo:</w:t>
+      </w:r>
+    </w:p>
+    <w:p>
+      <w:pPr>
+        <w:spacing w:before="60" w:after="60"/>
+      </w:pPr>
+      <w:r>
+        <w:t>The server's host key is not cached...</w:t>
+      </w:r>
+      <w:r>
+        <w:br/>
+        <w:t>Store key in cache? (y/n)</w:t>
+      </w:r>
+    </w:p>
+    <w:p>
+      <w:pPr>
+        <w:spacing w:before="60" w:after="60"/>
+      </w:pPr>
+      <w:r>
+        <w:t>Nhập:</w:t>
+      </w:r>
+    </w:p>
+    <w:p>
+      <w:pPr>
+        <w:spacing w:before="60" w:after="60"/>
+      </w:pPr>
+      <w:r>
+        <w:t>y</w:t>
+      </w:r>
+    </w:p>
+    <w:p>
+      <w:pPr>
+        <w:spacing w:before="60" w:after="60"/>
+      </w:pPr>
+      <w:r>
+        <w:t>Sau đó nhấn Enter.</w:t>
+      </w:r>
+    </w:p>
+    <w:p>
+      <w:pPr>
+        <w:spacing w:before="60" w:after="60"/>
+      </w:pPr>
+      <w:r>
+        <w:pict w14:anchorId="17744203">
+          <v:rect id="_x0000_i1051" style="width:0;height:1.5pt" o:hralign="center" o:hrstd="t" o:hr="t" fillcolor="#a0a0a0" stroked="f"/>
+        </w:pict>
+      </w:r>
+    </w:p>
+    <w:p>
+      <w:pPr>
+        <w:spacing w:before="60" w:after="60"/>
+        <w:rPr>
+          <w:b/>
+          <w:bCs/>
+        </w:rPr>
+      </w:pPr>
+      <w:r>
+        <w:rPr>
+          <w:b/>
+          <w:bCs/>
+        </w:rPr>
+        <w:t>Bước 3: Thoát phiên SSH</w:t>
+      </w:r>
+    </w:p>
+    <w:p>
+      <w:pPr>
+        <w:spacing w:before="60" w:after="60"/>
+      </w:pPr>
+      <w:r>
+        <w:t>Sau khi đăng nhập thành công vào VPS, gõ:</w:t>
+      </w:r>
+    </w:p>
+    <w:p>
+      <w:pPr>
+        <w:spacing w:before="60" w:after="60"/>
+      </w:pPr>
+      <w:r>
+        <w:t>exit</w:t>
+      </w:r>
+    </w:p>
+    <w:p>
+      <w:pPr>
+        <w:spacing w:before="60" w:after="60"/>
+      </w:pPr>
+      <w:r>
+        <w:t>để thoát.</w:t>
+      </w:r>
+    </w:p>
+    <w:p>
+      <w:pPr>
+        <w:spacing w:before="60" w:after="60"/>
+      </w:pPr>
+      <w:r>
+        <w:pict w14:anchorId="62153C4A">
+          <v:rect id="_x0000_i1052" style="width:0;height:1.5pt" o:hralign="center" o:hrstd="t" o:hr="t" fillcolor="#a0a0a0" stroked="f"/>
+        </w:pict>
+      </w:r>
+    </w:p>
+    <w:p>
+      <w:pPr>
+        <w:spacing w:before="60" w:after="60"/>
+        <w:rPr>
+          <w:b/>
+          <w:bCs/>
+        </w:rPr>
+      </w:pPr>
+      <w:r>
+        <w:rPr>
+          <w:b/>
+          <w:bCs/>
+        </w:rPr>
+        <w:t>Bước 4: Chạy lại tool tunnel</w:t>
+      </w:r>
+    </w:p>
+    <w:p>
+      <w:pPr>
+        <w:spacing w:before="60" w:after="60"/>
+      </w:pPr>
+      <w:r>
+        <w:t>Mở lại chương trình SshTunnelManager.exe.</w:t>
+      </w:r>
+    </w:p>
+    <w:p>
+      <w:pPr>
+        <w:spacing w:before="60" w:after="60"/>
+      </w:pPr>
+      <w:r>
+        <w:t>Lúc này plink.exe sẽ kết nối thành công vì host key đã được lưu vào PuTTY Registry.</w:t>
+      </w:r>
+    </w:p>
     <w:p>
       <w:pPr>
         <w:spacing w:before="60" w:after="60"/>
@@ -5756,12 +6114,6 @@
         <w:gridCol w:w="5560"/>
       </w:tblGrid>
       <w:tr>
-        <w:tblPrEx>
-          <w:tblCellMar>
-            <w:top w:w="0" w:type="dxa"/>
-            <w:bottom w:w="0" w:type="dxa"/>
-          </w:tblCellMar>
-        </w:tblPrEx>
         <w:tc>
           <w:tcPr>
             <w:tcW w:w="1000" w:type="dxa"/>
@@ -5788,7 +6140,6 @@
                 <w:sz w:val="20"/>
                 <w:szCs w:val="20"/>
               </w:rPr>
-              <w:lastRenderedPageBreak/>
               <w:t>Phím</w:t>
             </w:r>
           </w:p>
@@ -5855,12 +6206,6 @@
         </w:tc>
       </w:tr>
       <w:tr>
-        <w:tblPrEx>
-          <w:tblCellMar>
-            <w:top w:w="0" w:type="dxa"/>
-            <w:bottom w:w="0" w:type="dxa"/>
-          </w:tblCellMar>
-        </w:tblPrEx>
         <w:tc>
           <w:tcPr>
             <w:tcW w:w="1000" w:type="dxa"/>
@@ -5944,12 +6289,6 @@
         </w:tc>
       </w:tr>
       <w:tr>
-        <w:tblPrEx>
-          <w:tblCellMar>
-            <w:top w:w="0" w:type="dxa"/>
-            <w:bottom w:w="0" w:type="dxa"/>
-          </w:tblCellMar>
-        </w:tblPrEx>
         <w:tc>
           <w:tcPr>
             <w:tcW w:w="1000" w:type="dxa"/>
@@ -6033,12 +6372,6 @@
         </w:tc>
       </w:tr>
       <w:tr>
-        <w:tblPrEx>
-          <w:tblCellMar>
-            <w:top w:w="0" w:type="dxa"/>
-            <w:bottom w:w="0" w:type="dxa"/>
-          </w:tblCellMar>
-        </w:tblPrEx>
         <w:tc>
           <w:tcPr>
             <w:tcW w:w="1000" w:type="dxa"/>
@@ -6122,12 +6455,6 @@
         </w:tc>
       </w:tr>
       <w:tr>
-        <w:tblPrEx>
-          <w:tblCellMar>
-            <w:top w:w="0" w:type="dxa"/>
-            <w:bottom w:w="0" w:type="dxa"/>
-          </w:tblCellMar>
-        </w:tblPrEx>
         <w:tc>
           <w:tcPr>
             <w:tcW w:w="1000" w:type="dxa"/>
@@ -6211,12 +6538,6 @@
         </w:tc>
       </w:tr>
       <w:tr>
-        <w:tblPrEx>
-          <w:tblCellMar>
-            <w:top w:w="0" w:type="dxa"/>
-            <w:bottom w:w="0" w:type="dxa"/>
-          </w:tblCellMar>
-        </w:tblPrEx>
         <w:tc>
           <w:tcPr>
             <w:tcW w:w="1000" w:type="dxa"/>
@@ -6300,12 +6621,6 @@
         </w:tc>
       </w:tr>
       <w:tr>
-        <w:tblPrEx>
-          <w:tblCellMar>
-            <w:top w:w="0" w:type="dxa"/>
-            <w:bottom w:w="0" w:type="dxa"/>
-          </w:tblCellMar>
-        </w:tblPrEx>
         <w:tc>
           <w:tcPr>
             <w:tcW w:w="1000" w:type="dxa"/>
@@ -6389,12 +6704,6 @@
         </w:tc>
       </w:tr>
       <w:tr>
-        <w:tblPrEx>
-          <w:tblCellMar>
-            <w:top w:w="0" w:type="dxa"/>
-            <w:bottom w:w="0" w:type="dxa"/>
-          </w:tblCellMar>
-        </w:tblPrEx>
         <w:tc>
           <w:tcPr>
             <w:tcW w:w="1000" w:type="dxa"/>
@@ -6478,12 +6787,6 @@
         </w:tc>
       </w:tr>
       <w:tr>
-        <w:tblPrEx>
-          <w:tblCellMar>
-            <w:top w:w="0" w:type="dxa"/>
-            <w:bottom w:w="0" w:type="dxa"/>
-          </w:tblCellMar>
-        </w:tblPrEx>
         <w:tc>
           <w:tcPr>
             <w:tcW w:w="1000" w:type="dxa"/>
@@ -6567,12 +6870,6 @@
         </w:tc>
       </w:tr>
       <w:tr>
-        <w:tblPrEx>
-          <w:tblCellMar>
-            <w:top w:w="0" w:type="dxa"/>
-            <w:bottom w:w="0" w:type="dxa"/>
-          </w:tblCellMar>
-        </w:tblPrEx>
         <w:tc>
           <w:tcPr>
             <w:tcW w:w="1000" w:type="dxa"/>
@@ -6656,12 +6953,6 @@
         </w:tc>
       </w:tr>
       <w:tr>
-        <w:tblPrEx>
-          <w:tblCellMar>
-            <w:top w:w="0" w:type="dxa"/>
-            <w:bottom w:w="0" w:type="dxa"/>
-          </w:tblCellMar>
-        </w:tblPrEx>
         <w:tc>
           <w:tcPr>
             <w:tcW w:w="1000" w:type="dxa"/>
@@ -6883,6 +7174,155 @@
 <file path=word/numbering.xml><?xml version="1.0" encoding="utf-8"?>
 <w:numbering xmlns:wpc="http://schemas.microsoft.com/office/word/2010/wordprocessingCanvas" xmlns:cx="http://schemas.microsoft.com/office/drawing/2014/chartex" xmlns:cx1="http://schemas.microsoft.com/office/drawing/2015/9/8/chartex" xmlns:cx2="http://schemas.microsoft.com/office/drawing/2015/10/21/chartex" xmlns:cx3="http://schemas.microsoft.com/office/drawing/2016/5/9/chartex" xmlns:cx4="http://schemas.microsoft.com/office/drawing/2016/5/10/chartex" xmlns:cx5="http://schemas.microsoft.com/office/drawing/2016/5/11/chartex" xmlns:cx6="http://schemas.microsoft.com/office/drawing/2016/5/12/chartex" xmlns:cx7="http://schemas.microsoft.com/office/drawing/2016/5/13/chartex" xmlns:cx8="http://schemas.microsoft.com/office/drawing/2016/5/14/chartex" xmlns:mc="http://schemas.openxmlformats.org/markup-compatibility/2006" xmlns:aink="http://schemas.microsoft.com/office/drawing/2016/ink" xmlns:am3d="http://schemas.microsoft.com/office/drawing/2017/model3d" xmlns:o="urn:schemas-microsoft-com:office:office" xmlns:oel="http://schemas.microsoft.com/office/2019/extlst" xmlns:r="http://schemas.openxmlformats.org/officeDocument/2006/relationships" xmlns:m="http://schemas.openxmlformats.org/officeDocument/2006/math" xmlns:v="urn:schemas-microsoft-com:vml" xmlns:wp14="http://schemas.microsoft.com/office/word/2010/wordprocessingDrawing" xmlns:wp="http://schemas.openxmlformats.org/drawingml/2006/wordprocessingDrawing" xmlns:w10="urn:schemas-microsoft-com:office:word" xmlns:w="http://schemas.openxmlformats.org/wordprocessingml/2006/main" xmlns:w14="http://schemas.microsoft.com/office/word/2010/wordml" xmlns:w15="http://schemas.microsoft.com/office/word/2012/wordml" xmlns:w16cex="http://schemas.microsoft.com/office/word/2018/wordml/cex" xmlns:w16cid="http://schemas.microsoft.com/office/word/2016/wordml/cid" xmlns:w16="http://schemas.microsoft.com/office/word/2018/wordml" xmlns:w16du="http://schemas.microsoft.com/office/word/2023/wordml/word16du" xmlns:w16sdtdh="http://schemas.microsoft.com/office/word/2020/wordml/sdtdatahash" xmlns:w16sdtfl="http://schemas.microsoft.com/office/word/2024/wordml/sdtformatlock" xmlns:w16se="http://schemas.microsoft.com/office/word/2015/wordml/symex" xmlns:wpg="http://schemas.microsoft.com/office/word/2010/wordprocessingGroup" xmlns:wpi="http://schemas.microsoft.com/office/word/2010/wordprocessingInk" xmlns:wne="http://schemas.microsoft.com/office/word/2006/wordml" xmlns:wps="http://schemas.microsoft.com/office/word/2010/wordprocessingShape" mc:Ignorable="w14 w15 w16se w16cid w16 w16cex w16sdtdh w16sdtfl w16du wp14">
   <w:abstractNum w:abstractNumId="0" w15:restartNumberingAfterBreak="0">
+    <w:nsid w:val="1619680F"/>
+    <w:multiLevelType w:val="multilevel"/>
+    <w:tmpl w:val="B478E9E0"/>
+    <w:lvl w:ilvl="0">
+      <w:start w:val="1"/>
+      <w:numFmt w:val="bullet"/>
+      <w:lvlText w:val=""/>
+      <w:lvlJc w:val="left"/>
+      <w:pPr>
+        <w:tabs>
+          <w:tab w:val="num" w:pos="720"/>
+        </w:tabs>
+        <w:ind w:left="720" w:hanging="360"/>
+      </w:pPr>
+      <w:rPr>
+        <w:rFonts w:ascii="Symbol" w:hAnsi="Symbol" w:hint="default"/>
+        <w:sz w:val="20"/>
+      </w:rPr>
+    </w:lvl>
+    <w:lvl w:ilvl="1" w:tentative="1">
+      <w:start w:val="1"/>
+      <w:numFmt w:val="bullet"/>
+      <w:lvlText w:val="o"/>
+      <w:lvlJc w:val="left"/>
+      <w:pPr>
+        <w:tabs>
+          <w:tab w:val="num" w:pos="1440"/>
+        </w:tabs>
+        <w:ind w:left="1440" w:hanging="360"/>
+      </w:pPr>
+      <w:rPr>
+        <w:rFonts w:ascii="Courier New" w:hAnsi="Courier New" w:hint="default"/>
+        <w:sz w:val="20"/>
+      </w:rPr>
+    </w:lvl>
+    <w:lvl w:ilvl="2" w:tentative="1">
+      <w:start w:val="1"/>
+      <w:numFmt w:val="bullet"/>
+      <w:lvlText w:val=""/>
+      <w:lvlJc w:val="left"/>
+      <w:pPr>
+        <w:tabs>
+          <w:tab w:val="num" w:pos="2160"/>
+        </w:tabs>
+        <w:ind w:left="2160" w:hanging="360"/>
+      </w:pPr>
+      <w:rPr>
+        <w:rFonts w:ascii="Wingdings" w:hAnsi="Wingdings" w:hint="default"/>
+        <w:sz w:val="20"/>
+      </w:rPr>
+    </w:lvl>
+    <w:lvl w:ilvl="3" w:tentative="1">
+      <w:start w:val="1"/>
+      <w:numFmt w:val="bullet"/>
+      <w:lvlText w:val=""/>
+      <w:lvlJc w:val="left"/>
+      <w:pPr>
+        <w:tabs>
+          <w:tab w:val="num" w:pos="2880"/>
+        </w:tabs>
+        <w:ind w:left="2880" w:hanging="360"/>
+      </w:pPr>
+      <w:rPr>
+        <w:rFonts w:ascii="Wingdings" w:hAnsi="Wingdings" w:hint="default"/>
+        <w:sz w:val="20"/>
+      </w:rPr>
+    </w:lvl>
+    <w:lvl w:ilvl="4" w:tentative="1">
+      <w:start w:val="1"/>
+      <w:numFmt w:val="bullet"/>
+      <w:lvlText w:val=""/>
+      <w:lvlJc w:val="left"/>
+      <w:pPr>
+        <w:tabs>
+          <w:tab w:val="num" w:pos="3600"/>
+        </w:tabs>
+        <w:ind w:left="3600" w:hanging="360"/>
+      </w:pPr>
+      <w:rPr>
+        <w:rFonts w:ascii="Wingdings" w:hAnsi="Wingdings" w:hint="default"/>
+        <w:sz w:val="20"/>
+      </w:rPr>
+    </w:lvl>
+    <w:lvl w:ilvl="5" w:tentative="1">
+      <w:start w:val="1"/>
+      <w:numFmt w:val="bullet"/>
+      <w:lvlText w:val=""/>
+      <w:lvlJc w:val="left"/>
+      <w:pPr>
+        <w:tabs>
+          <w:tab w:val="num" w:pos="4320"/>
+        </w:tabs>
+        <w:ind w:left="4320" w:hanging="360"/>
+      </w:pPr>
+      <w:rPr>
+        <w:rFonts w:ascii="Wingdings" w:hAnsi="Wingdings" w:hint="default"/>
+        <w:sz w:val="20"/>
+      </w:rPr>
+    </w:lvl>
+    <w:lvl w:ilvl="6" w:tentative="1">
+      <w:start w:val="1"/>
+      <w:numFmt w:val="bullet"/>
+      <w:lvlText w:val=""/>
+      <w:lvlJc w:val="left"/>
+      <w:pPr>
+        <w:tabs>
+          <w:tab w:val="num" w:pos="5040"/>
+        </w:tabs>
+        <w:ind w:left="5040" w:hanging="360"/>
+      </w:pPr>
+      <w:rPr>
+        <w:rFonts w:ascii="Wingdings" w:hAnsi="Wingdings" w:hint="default"/>
+        <w:sz w:val="20"/>
+      </w:rPr>
+    </w:lvl>
+    <w:lvl w:ilvl="7" w:tentative="1">
+      <w:start w:val="1"/>
+      <w:numFmt w:val="bullet"/>
+      <w:lvlText w:val=""/>
+      <w:lvlJc w:val="left"/>
+      <w:pPr>
+        <w:tabs>
+          <w:tab w:val="num" w:pos="5760"/>
+        </w:tabs>
+        <w:ind w:left="5760" w:hanging="360"/>
+      </w:pPr>
+      <w:rPr>
+        <w:rFonts w:ascii="Wingdings" w:hAnsi="Wingdings" w:hint="default"/>
+        <w:sz w:val="20"/>
+      </w:rPr>
+    </w:lvl>
+    <w:lvl w:ilvl="8" w:tentative="1">
+      <w:start w:val="1"/>
+      <w:numFmt w:val="bullet"/>
+      <w:lvlText w:val=""/>
+      <w:lvlJc w:val="left"/>
+      <w:pPr>
+        <w:tabs>
+          <w:tab w:val="num" w:pos="6480"/>
+        </w:tabs>
+        <w:ind w:left="6480" w:hanging="360"/>
+      </w:pPr>
+      <w:rPr>
+        <w:rFonts w:ascii="Wingdings" w:hAnsi="Wingdings" w:hint="default"/>
+        <w:sz w:val="20"/>
+      </w:rPr>
+    </w:lvl>
+  </w:abstractNum>
+  <w:abstractNum w:abstractNumId="1" w15:restartNumberingAfterBreak="0">
     <w:nsid w:val="17666880"/>
     <w:multiLevelType w:val="hybridMultilevel"/>
     <w:tmpl w:val="2708B018"/>
@@ -6968,7 +7408,7 @@
       </w:pPr>
     </w:lvl>
   </w:abstractNum>
-  <w:abstractNum w:abstractNumId="1" w15:restartNumberingAfterBreak="0">
+  <w:abstractNum w:abstractNumId="2" w15:restartNumberingAfterBreak="0">
     <w:nsid w:val="4F274F8E"/>
     <w:multiLevelType w:val="hybridMultilevel"/>
     <w:tmpl w:val="9F006E40"/>
@@ -7022,7 +7462,7 @@
       <w:lvlJc w:val="left"/>
     </w:lvl>
   </w:abstractNum>
-  <w:abstractNum w:abstractNumId="2" w15:restartNumberingAfterBreak="0">
+  <w:abstractNum w:abstractNumId="3" w15:restartNumberingAfterBreak="0">
     <w:nsid w:val="5BFA53AD"/>
     <w:multiLevelType w:val="hybridMultilevel"/>
     <w:tmpl w:val="C884FF94"/>
@@ -7076,17 +7516,172 @@
       <w:lvlJc w:val="left"/>
     </w:lvl>
   </w:abstractNum>
+  <w:abstractNum w:abstractNumId="4" w15:restartNumberingAfterBreak="0">
+    <w:nsid w:val="62006033"/>
+    <w:multiLevelType w:val="multilevel"/>
+    <w:tmpl w:val="7B3ADC88"/>
+    <w:lvl w:ilvl="0">
+      <w:start w:val="1"/>
+      <w:numFmt w:val="bullet"/>
+      <w:lvlText w:val=""/>
+      <w:lvlJc w:val="left"/>
+      <w:pPr>
+        <w:tabs>
+          <w:tab w:val="num" w:pos="720"/>
+        </w:tabs>
+        <w:ind w:left="720" w:hanging="360"/>
+      </w:pPr>
+      <w:rPr>
+        <w:rFonts w:ascii="Symbol" w:hAnsi="Symbol" w:hint="default"/>
+        <w:sz w:val="20"/>
+      </w:rPr>
+    </w:lvl>
+    <w:lvl w:ilvl="1" w:tentative="1">
+      <w:start w:val="1"/>
+      <w:numFmt w:val="bullet"/>
+      <w:lvlText w:val="o"/>
+      <w:lvlJc w:val="left"/>
+      <w:pPr>
+        <w:tabs>
+          <w:tab w:val="num" w:pos="1440"/>
+        </w:tabs>
+        <w:ind w:left="1440" w:hanging="360"/>
+      </w:pPr>
+      <w:rPr>
+        <w:rFonts w:ascii="Courier New" w:hAnsi="Courier New" w:hint="default"/>
+        <w:sz w:val="20"/>
+      </w:rPr>
+    </w:lvl>
+    <w:lvl w:ilvl="2" w:tentative="1">
+      <w:start w:val="1"/>
+      <w:numFmt w:val="bullet"/>
+      <w:lvlText w:val=""/>
+      <w:lvlJc w:val="left"/>
+      <w:pPr>
+        <w:tabs>
+          <w:tab w:val="num" w:pos="2160"/>
+        </w:tabs>
+        <w:ind w:left="2160" w:hanging="360"/>
+      </w:pPr>
+      <w:rPr>
+        <w:rFonts w:ascii="Wingdings" w:hAnsi="Wingdings" w:hint="default"/>
+        <w:sz w:val="20"/>
+      </w:rPr>
+    </w:lvl>
+    <w:lvl w:ilvl="3" w:tentative="1">
+      <w:start w:val="1"/>
+      <w:numFmt w:val="bullet"/>
+      <w:lvlText w:val=""/>
+      <w:lvlJc w:val="left"/>
+      <w:pPr>
+        <w:tabs>
+          <w:tab w:val="num" w:pos="2880"/>
+        </w:tabs>
+        <w:ind w:left="2880" w:hanging="360"/>
+      </w:pPr>
+      <w:rPr>
+        <w:rFonts w:ascii="Wingdings" w:hAnsi="Wingdings" w:hint="default"/>
+        <w:sz w:val="20"/>
+      </w:rPr>
+    </w:lvl>
+    <w:lvl w:ilvl="4" w:tentative="1">
+      <w:start w:val="1"/>
+      <w:numFmt w:val="bullet"/>
+      <w:lvlText w:val=""/>
+      <w:lvlJc w:val="left"/>
+      <w:pPr>
+        <w:tabs>
+          <w:tab w:val="num" w:pos="3600"/>
+        </w:tabs>
+        <w:ind w:left="3600" w:hanging="360"/>
+      </w:pPr>
+      <w:rPr>
+        <w:rFonts w:ascii="Wingdings" w:hAnsi="Wingdings" w:hint="default"/>
+        <w:sz w:val="20"/>
+      </w:rPr>
+    </w:lvl>
+    <w:lvl w:ilvl="5" w:tentative="1">
+      <w:start w:val="1"/>
+      <w:numFmt w:val="bullet"/>
+      <w:lvlText w:val=""/>
+      <w:lvlJc w:val="left"/>
+      <w:pPr>
+        <w:tabs>
+          <w:tab w:val="num" w:pos="4320"/>
+        </w:tabs>
+        <w:ind w:left="4320" w:hanging="360"/>
+      </w:pPr>
+      <w:rPr>
+        <w:rFonts w:ascii="Wingdings" w:hAnsi="Wingdings" w:hint="default"/>
+        <w:sz w:val="20"/>
+      </w:rPr>
+    </w:lvl>
+    <w:lvl w:ilvl="6" w:tentative="1">
+      <w:start w:val="1"/>
+      <w:numFmt w:val="bullet"/>
+      <w:lvlText w:val=""/>
+      <w:lvlJc w:val="left"/>
+      <w:pPr>
+        <w:tabs>
+          <w:tab w:val="num" w:pos="5040"/>
+        </w:tabs>
+        <w:ind w:left="5040" w:hanging="360"/>
+      </w:pPr>
+      <w:rPr>
+        <w:rFonts w:ascii="Wingdings" w:hAnsi="Wingdings" w:hint="default"/>
+        <w:sz w:val="20"/>
+      </w:rPr>
+    </w:lvl>
+    <w:lvl w:ilvl="7" w:tentative="1">
+      <w:start w:val="1"/>
+      <w:numFmt w:val="bullet"/>
+      <w:lvlText w:val=""/>
+      <w:lvlJc w:val="left"/>
+      <w:pPr>
+        <w:tabs>
+          <w:tab w:val="num" w:pos="5760"/>
+        </w:tabs>
+        <w:ind w:left="5760" w:hanging="360"/>
+      </w:pPr>
+      <w:rPr>
+        <w:rFonts w:ascii="Wingdings" w:hAnsi="Wingdings" w:hint="default"/>
+        <w:sz w:val="20"/>
+      </w:rPr>
+    </w:lvl>
+    <w:lvl w:ilvl="8" w:tentative="1">
+      <w:start w:val="1"/>
+      <w:numFmt w:val="bullet"/>
+      <w:lvlText w:val=""/>
+      <w:lvlJc w:val="left"/>
+      <w:pPr>
+        <w:tabs>
+          <w:tab w:val="num" w:pos="6480"/>
+        </w:tabs>
+        <w:ind w:left="6480" w:hanging="360"/>
+      </w:pPr>
+      <w:rPr>
+        <w:rFonts w:ascii="Wingdings" w:hAnsi="Wingdings" w:hint="default"/>
+        <w:sz w:val="20"/>
+      </w:rPr>
+    </w:lvl>
+  </w:abstractNum>
   <w:num w:numId="1" w16cid:durableId="394402650">
-    <w:abstractNumId w:val="0"/>
+    <w:abstractNumId w:val="1"/>
     <w:lvlOverride w:ilvl="0">
       <w:startOverride w:val="1"/>
     </w:lvlOverride>
   </w:num>
   <w:num w:numId="2" w16cid:durableId="1115752069">
-    <w:abstractNumId w:val="2"/>
+    <w:abstractNumId w:val="3"/>
     <w:lvlOverride w:ilvl="0">
       <w:startOverride w:val="1"/>
     </w:lvlOverride>
+  </w:num>
+  <w:num w:numId="3" w16cid:durableId="1693727393">
+    <w:abstractNumId w:val="0"/>
+  </w:num>
+  <w:num w:numId="4" w16cid:durableId="2053651551">
+    <w:abstractNumId w:val="4"/>
   </w:num>
 </w:numbering>
 </file>
@@ -7579,7 +8174,6 @@
   <w:style w:type="character" w:default="1" w:styleId="DefaultParagraphFont">
     <w:name w:val="Default Paragraph Font"/>
     <w:uiPriority w:val="1"/>
-    <w:semiHidden/>
     <w:unhideWhenUsed/>
   </w:style>
   <w:style w:type="table" w:default="1" w:styleId="TableNormal">

</xml_diff>